<commit_message>
Add enterprise solution-options analysis to the overview document
New "How We Arrived at EGPA" section: problem discovery & validation,
the three genuinely different platform-level options (extend existing
GRC/ITSM, buy an AI-governance product, build), a trade-off table
across seven dimensions, build-vs-buy rationale, and an incremental
current-to-target-state migration path.

Also refreshes Business Value with current production numbers and
adds the two new real metrics, and adds a Phased Implementation &
Roadmap section (the content that used to be the removed /roadmap
page, now framed as document content instead of a live feature).
</commit_message>
<xml_diff>
--- a/docs/EGPA-Overview.docx
+++ b/docs/EGPA-Overview.docx
@@ -172,7 +172,7 @@
           <w:sz w:val="21"/>
           <w:szCs w:val="21"/>
         </w:rPr>
-        <w:t xml:space="preserve">Every capability described in this document is live and independently verifiable in production: real database, real authentication, real multi-agent tool-calling, real deployment across Vercel, Google Cloud Run, and Neon Postgres, and a tamper-evident, hash-chained audit log. Where something is deliberately out of scope, this document says so explicitly — see “Honest Scope” on page 6.</w:t>
+        <w:t xml:space="preserve">Every capability described in this document is live and independently verifiable in production: real database, real authentication, real multi-agent tool-calling, real deployment across Vercel, Google Cloud Run, and Neon Postgres, and a tamper-evident, hash-chained audit log. Where something is deliberately out of scope, this document says so explicitly — see “Honest Scope” later in this document.</w:t>
       </w:r>
     </w:p>
     <w:p>
@@ -221,6 +221,1567 @@
           <w:szCs w:val="21"/>
         </w:rPr>
         <w:t xml:space="preserve">Manual review does not scale to that volume, and informal governance — a wiki page of guidelines, a Slack approval thread — leaves no enforceable record and no way to prove, after the fact, that a control was actually satisfied rather than merely acknowledged. The result is either a governance bottleneck that pushes teams to build outside the process entirely, or a paper-thin governance layer that does not hold up under audit.</w:t>
+      </w:r>
+    </w:p>
+    <w:p>
+      <w:pPr>
+        <w:pStyle w:val="Heading1"/>
+        <w:pBdr>
+          <w:bottom w:val="single" w:color="1A9C94" w:sz="8" w:space="6"/>
+        </w:pBdr>
+        <w:spacing w:after="200" w:before="480"/>
+      </w:pPr>
+      <w:r>
+        <w:rPr>
+          <w:rFonts w:ascii="Cambria" w:cs="Cambria" w:eastAsia="Cambria" w:hAnsi="Cambria"/>
+          <w:b/>
+          <w:bCs/>
+          <w:color w:val="0A2A43"/>
+          <w:sz w:val="30"/>
+          <w:szCs w:val="30"/>
+        </w:rPr>
+        <w:t xml:space="preserve">How We Arrived at EGPA: Problem Validation &amp; Option Analysis</w:t>
+      </w:r>
+    </w:p>
+    <w:p>
+      <w:pPr>
+        <w:spacing w:after="200" w:line="300"/>
+      </w:pPr>
+      <w:r>
+        <w:rPr>
+          <w:rFonts w:ascii="Calibri" w:cs="Calibri" w:eastAsia="Calibri" w:hAnsi="Calibri"/>
+          <w:i/>
+          <w:iCs/>
+          <w:color w:val="5B6472"/>
+          <w:sz w:val="23"/>
+          <w:szCs w:val="23"/>
+        </w:rPr>
+        <w:t xml:space="preserve">What follows is the reasoning that precedes the product, not the product itself — included so the decision is auditable, not just the outcome.</w:t>
+      </w:r>
+    </w:p>
+    <w:p>
+      <w:pPr>
+        <w:pStyle w:val="Heading2"/>
+        <w:spacing w:after="140" w:before="320"/>
+      </w:pPr>
+      <w:r>
+        <w:rPr>
+          <w:rFonts w:ascii="Cambria" w:cs="Cambria" w:eastAsia="Cambria" w:hAnsi="Cambria"/>
+          <w:b/>
+          <w:bCs/>
+          <w:color w:val="0A2A43"/>
+          <w:sz w:val="24"/>
+          <w:szCs w:val="24"/>
+        </w:rPr>
+        <w:t xml:space="preserve">Problem discovery and validation</w:t>
+      </w:r>
+    </w:p>
+    <w:p>
+      <w:pPr>
+        <w:spacing w:after="160" w:line="288"/>
+      </w:pPr>
+      <w:r>
+        <w:rPr>
+          <w:rFonts w:ascii="Calibri" w:cs="Calibri" w:eastAsia="Calibri" w:hAnsi="Calibri"/>
+          <w:color w:val="1F2937"/>
+          <w:sz w:val="21"/>
+          <w:szCs w:val="21"/>
+        </w:rPr>
+        <w:t xml:space="preserve">Before any platform is the right answer, the underlying business problem needs to be established, not assumed. For a federated organization, that means talking to the people on both sides of the tension described above: Enterprise Architecture and platform engineering (who own whatever gets built), Risk, Compliance, and Legal (who own what "acceptable" means), individual business-unit technology leads (who own the actual demand for AI use cases), Information Security, and the owners of whatever GRC and ITSM tooling already exists — plus a representative sample of the requesters themselves, since a governance process nobody uses is not a governance process.</w:t>
+      </w:r>
+    </w:p>
+    <w:p>
+      <w:pPr>
+        <w:spacing w:after="160" w:line="288"/>
+      </w:pPr>
+      <w:r>
+        <w:rPr>
+          <w:rFonts w:ascii="Calibri" w:cs="Calibri" w:eastAsia="Calibri" w:hAnsi="Calibri"/>
+          <w:color w:val="1F2937"/>
+          <w:sz w:val="21"/>
+          <w:szCs w:val="21"/>
+        </w:rPr>
+        <w:t xml:space="preserve">A handful of assumptions would need real testing before any solution — including EGPA — is confirmed as the right one:</w:t>
+      </w:r>
+    </w:p>
+    <w:p>
+      <w:pPr>
+        <w:pStyle w:val="ListParagraph"/>
+        <w:numPr>
+          <w:ilvl w:val="0"/>
+          <w:numId w:val="2"/>
+        </w:numPr>
+        <w:spacing w:after="90" w:line="276"/>
+      </w:pPr>
+      <w:r>
+        <w:rPr>
+          <w:rFonts w:ascii="Calibri" w:cs="Calibri" w:eastAsia="Calibri" w:hAnsi="Calibri"/>
+          <w:color w:val="1F2937"/>
+          <w:sz w:val="21"/>
+          <w:szCs w:val="21"/>
+        </w:rPr>
+        <w:t xml:space="preserve">That existing GRC/ITSM tooling genuinely cannot absorb AI-specific risk dimensions (model/vendor exposure, runtime tool-call auditing, a live kill-switch) without disproportionate custom development — tested by a real extensibility review of the org's actual platform, not a generic assumption about GRC tools.</w:t>
+      </w:r>
+    </w:p>
+    <w:p>
+      <w:pPr>
+        <w:pStyle w:val="ListParagraph"/>
+        <w:numPr>
+          <w:ilvl w:val="0"/>
+          <w:numId w:val="2"/>
+        </w:numPr>
+        <w:spacing w:after="90" w:line="276"/>
+      </w:pPr>
+      <w:r>
+        <w:rPr>
+          <w:rFonts w:ascii="Calibri" w:cs="Calibri" w:eastAsia="Calibri" w:hAnsi="Calibri"/>
+          <w:color w:val="1F2937"/>
+          <w:sz w:val="21"/>
+          <w:szCs w:val="21"/>
+        </w:rPr>
+        <w:t xml:space="preserve">That the volume and velocity of AI use-case requests will genuinely exceed what manual, person-by-person review can sustain — tested against real or projected request volume, not anecdote.</w:t>
+      </w:r>
+    </w:p>
+    <w:p>
+      <w:pPr>
+        <w:pStyle w:val="ListParagraph"/>
+        <w:numPr>
+          <w:ilvl w:val="0"/>
+          <w:numId w:val="2"/>
+        </w:numPr>
+        <w:spacing w:after="90" w:line="276"/>
+      </w:pPr>
+      <w:r>
+        <w:rPr>
+          <w:rFonts w:ascii="Calibri" w:cs="Calibri" w:eastAsia="Calibri" w:hAnsi="Calibri"/>
+          <w:color w:val="1F2937"/>
+          <w:sz w:val="21"/>
+          <w:szCs w:val="21"/>
+        </w:rPr>
+        <w:t xml:space="preserve">That business units will actually route new AI use cases through a centrally governed intake process rather than building around it — tested by interviewing the business units most likely to resist, not the most cooperative ones.</w:t>
+      </w:r>
+    </w:p>
+    <w:p>
+      <w:pPr>
+        <w:pStyle w:val="ListParagraph"/>
+        <w:numPr>
+          <w:ilvl w:val="0"/>
+          <w:numId w:val="2"/>
+        </w:numPr>
+        <w:spacing w:after="90" w:line="276"/>
+      </w:pPr>
+      <w:r>
+        <w:rPr>
+          <w:rFonts w:ascii="Calibri" w:cs="Calibri" w:eastAsia="Calibri" w:hAnsi="Calibri"/>
+          <w:color w:val="1F2937"/>
+          <w:sz w:val="21"/>
+          <w:szCs w:val="21"/>
+        </w:rPr>
+        <w:t xml:space="preserve">That risk can be meaningfully computed from a structured questionnaire rather than requiring expert judgment on every single case — tested by validating a proposed scoring model against real historical use cases and seeing whether it agrees with what an expert reviewer would have concluded.</w:t>
+      </w:r>
+    </w:p>
+    <w:p>
+      <w:pPr>
+        <w:pStyle w:val="Heading2"/>
+        <w:spacing w:after="140" w:before="320"/>
+      </w:pPr>
+      <w:r>
+        <w:rPr>
+          <w:rFonts w:ascii="Cambria" w:cs="Cambria" w:eastAsia="Cambria" w:hAnsi="Cambria"/>
+          <w:b/>
+          <w:bCs/>
+          <w:color w:val="0A2A43"/>
+          <w:sz w:val="24"/>
+          <w:szCs w:val="24"/>
+        </w:rPr>
+        <w:t xml:space="preserve">Alternative enterprise approaches</w:t>
+      </w:r>
+    </w:p>
+    <w:p>
+      <w:pPr>
+        <w:spacing w:after="160" w:line="288"/>
+      </w:pPr>
+      <w:r>
+        <w:rPr>
+          <w:rFonts w:ascii="Calibri" w:cs="Calibri" w:eastAsia="Calibri" w:hAnsi="Calibri"/>
+          <w:color w:val="1F2937"/>
+          <w:sz w:val="21"/>
+          <w:szCs w:val="21"/>
+        </w:rPr>
+        <w:t xml:space="preserve">At the platform level — not the technology level — there are three genuinely different ways to solve this problem:</w:t>
+      </w:r>
+    </w:p>
+    <w:p>
+      <w:pPr>
+        <w:pStyle w:val="ListParagraph"/>
+        <w:numPr>
+          <w:ilvl w:val="0"/>
+          <w:numId w:val="2"/>
+        </w:numPr>
+        <w:spacing w:after="90" w:line="276"/>
+      </w:pPr>
+      <w:r>
+        <w:rPr>
+          <w:rFonts w:ascii="Calibri" w:cs="Calibri" w:eastAsia="Calibri" w:hAnsi="Calibri"/>
+          <w:b/>
+          <w:bCs/>
+          <w:color w:val="1F2937"/>
+          <w:sz w:val="21"/>
+          <w:szCs w:val="21"/>
+        </w:rPr>
+        <w:t xml:space="preserve">Extend existing governance, architecture, and service-management platforms. Add an "AI use case" request type, a risk questionnaire, and an approval workflow to whatever GRC and ITSM tooling the organization already runs.</w:t>
+      </w:r>
+    </w:p>
+    <w:p>
+      <w:pPr>
+        <w:pStyle w:val="ListParagraph"/>
+        <w:numPr>
+          <w:ilvl w:val="0"/>
+          <w:numId w:val="2"/>
+        </w:numPr>
+        <w:spacing w:after="90" w:line="276"/>
+      </w:pPr>
+      <w:r>
+        <w:rPr>
+          <w:rFonts w:ascii="Calibri" w:cs="Calibri" w:eastAsia="Calibri" w:hAnsi="Calibri"/>
+          <w:b/>
+          <w:bCs/>
+          <w:color w:val="1F2937"/>
+          <w:sz w:val="21"/>
+          <w:szCs w:val="21"/>
+        </w:rPr>
+        <w:t xml:space="preserve">Procure and configure an established AI governance product. Buy a commercial AI/model-risk-governance platform and configure it to the organization's control requirements.</w:t>
+      </w:r>
+    </w:p>
+    <w:p>
+      <w:pPr>
+        <w:pStyle w:val="ListParagraph"/>
+        <w:numPr>
+          <w:ilvl w:val="0"/>
+          <w:numId w:val="2"/>
+        </w:numPr>
+        <w:spacing w:after="90" w:line="276"/>
+      </w:pPr>
+      <w:r>
+        <w:rPr>
+          <w:rFonts w:ascii="Calibri" w:cs="Calibri" w:eastAsia="Calibri" w:hAnsi="Calibri"/>
+          <w:b/>
+          <w:bCs/>
+          <w:color w:val="1F2937"/>
+          <w:sz w:val="21"/>
+          <w:szCs w:val="21"/>
+        </w:rPr>
+        <w:t xml:space="preserve">Build a dedicated enterprise AI governance and execution platform, such as EGPA. Purpose-built control plane, tailored to the organization's own risk taxonomy and coupled directly to its own AI Gateway and execution substrate.</w:t>
+      </w:r>
+    </w:p>
+    <w:p>
+      <w:pPr>
+        <w:pStyle w:val="Heading2"/>
+        <w:spacing w:after="140" w:before="320"/>
+      </w:pPr>
+      <w:r>
+        <w:rPr>
+          <w:rFonts w:ascii="Cambria" w:cs="Cambria" w:eastAsia="Cambria" w:hAnsi="Cambria"/>
+          <w:b/>
+          <w:bCs/>
+          <w:color w:val="0A2A43"/>
+          <w:sz w:val="24"/>
+          <w:szCs w:val="24"/>
+        </w:rPr>
+        <w:t xml:space="preserve">Options and trade-offs</w:t>
+      </w:r>
+    </w:p>
+    <w:tbl>
+      <w:tblPr>
+        <w:tblW w:type="dxa" w:w="9600"/>
+        <w:tblBorders>
+          <w:top w:val="single" w:color="auto" w:sz="4"/>
+          <w:left w:val="single" w:color="auto" w:sz="4"/>
+          <w:bottom w:val="single" w:color="auto" w:sz="4"/>
+          <w:right w:val="single" w:color="auto" w:sz="4"/>
+          <w:insideH w:val="single" w:color="auto" w:sz="4"/>
+          <w:insideV w:val="single" w:color="auto" w:sz="4"/>
+        </w:tblBorders>
+      </w:tblPr>
+      <w:tblGrid>
+        <w:gridCol w:w="1650"/>
+        <w:gridCol w:w="2650"/>
+        <w:gridCol w:w="2650"/>
+        <w:gridCol w:w="2650"/>
+      </w:tblGrid>
+      <w:tr>
+        <w:trPr>
+          <w:tblHeader/>
+        </w:trPr>
+        <w:tc>
+          <w:tcPr>
+            <w:tcW w:type="dxa" w:w="1650"/>
+            <w:shd w:fill="0A2A43" w:val="clear"/>
+            <w:tcMar>
+              <w:top w:type="dxa" w:w="100"/>
+              <w:left w:type="dxa" w:w="140"/>
+              <w:bottom w:type="dxa" w:w="100"/>
+              <w:right w:type="dxa" w:w="140"/>
+            </w:tcMar>
+            <w:vAlign w:val="center"/>
+          </w:tcPr>
+          <w:p>
+            <w:pPr>
+              <w:jc w:val="left"/>
+            </w:pPr>
+            <w:r>
+              <w:rPr>
+                <w:rFonts w:ascii="Calibri" w:cs="Calibri" w:eastAsia="Calibri" w:hAnsi="Calibri"/>
+                <w:b/>
+                <w:bCs/>
+                <w:color w:val="FFFFFF"/>
+                <w:sz w:val="19"/>
+                <w:szCs w:val="19"/>
+              </w:rPr>
+              <w:t xml:space="preserve">Dimension</w:t>
+            </w:r>
+          </w:p>
+        </w:tc>
+        <w:tc>
+          <w:tcPr>
+            <w:tcW w:type="dxa" w:w="2650"/>
+            <w:shd w:fill="0A2A43" w:val="clear"/>
+            <w:tcMar>
+              <w:top w:type="dxa" w:w="100"/>
+              <w:left w:type="dxa" w:w="140"/>
+              <w:bottom w:type="dxa" w:w="100"/>
+              <w:right w:type="dxa" w:w="140"/>
+            </w:tcMar>
+            <w:vAlign w:val="center"/>
+          </w:tcPr>
+          <w:p>
+            <w:pPr>
+              <w:jc w:val="left"/>
+            </w:pPr>
+            <w:r>
+              <w:rPr>
+                <w:rFonts w:ascii="Calibri" w:cs="Calibri" w:eastAsia="Calibri" w:hAnsi="Calibri"/>
+                <w:b/>
+                <w:bCs/>
+                <w:color w:val="FFFFFF"/>
+                <w:sz w:val="19"/>
+                <w:szCs w:val="19"/>
+              </w:rPr>
+              <w:t xml:space="preserve">Extend existing GRC/ITSM</w:t>
+            </w:r>
+          </w:p>
+        </w:tc>
+        <w:tc>
+          <w:tcPr>
+            <w:tcW w:type="dxa" w:w="2650"/>
+            <w:shd w:fill="0A2A43" w:val="clear"/>
+            <w:tcMar>
+              <w:top w:type="dxa" w:w="100"/>
+              <w:left w:type="dxa" w:w="140"/>
+              <w:bottom w:type="dxa" w:w="100"/>
+              <w:right w:type="dxa" w:w="140"/>
+            </w:tcMar>
+            <w:vAlign w:val="center"/>
+          </w:tcPr>
+          <w:p>
+            <w:pPr>
+              <w:jc w:val="left"/>
+            </w:pPr>
+            <w:r>
+              <w:rPr>
+                <w:rFonts w:ascii="Calibri" w:cs="Calibri" w:eastAsia="Calibri" w:hAnsi="Calibri"/>
+                <w:b/>
+                <w:bCs/>
+                <w:color w:val="FFFFFF"/>
+                <w:sz w:val="19"/>
+                <w:szCs w:val="19"/>
+              </w:rPr>
+              <w:t xml:space="preserve">Buy an AI governance product</w:t>
+            </w:r>
+          </w:p>
+        </w:tc>
+        <w:tc>
+          <w:tcPr>
+            <w:tcW w:type="dxa" w:w="2650"/>
+            <w:shd w:fill="0A2A43" w:val="clear"/>
+            <w:tcMar>
+              <w:top w:type="dxa" w:w="100"/>
+              <w:left w:type="dxa" w:w="140"/>
+              <w:bottom w:type="dxa" w:w="100"/>
+              <w:right w:type="dxa" w:w="140"/>
+            </w:tcMar>
+            <w:vAlign w:val="center"/>
+          </w:tcPr>
+          <w:p>
+            <w:pPr>
+              <w:jc w:val="left"/>
+            </w:pPr>
+            <w:r>
+              <w:rPr>
+                <w:rFonts w:ascii="Calibri" w:cs="Calibri" w:eastAsia="Calibri" w:hAnsi="Calibri"/>
+                <w:b/>
+                <w:bCs/>
+                <w:color w:val="FFFFFF"/>
+                <w:sz w:val="19"/>
+                <w:szCs w:val="19"/>
+              </w:rPr>
+              <w:t xml:space="preserve">Build (EGPA)</w:t>
+            </w:r>
+          </w:p>
+        </w:tc>
+      </w:tr>
+      <w:tr>
+        <w:tc>
+          <w:tcPr>
+            <w:tcW w:type="dxa" w:w="1650"/>
+            <w:shd w:fill="FFFFFF" w:val="clear"/>
+            <w:tcMar>
+              <w:top w:type="dxa" w:w="100"/>
+              <w:left w:type="dxa" w:w="140"/>
+              <w:bottom w:type="dxa" w:w="100"/>
+              <w:right w:type="dxa" w:w="140"/>
+            </w:tcMar>
+            <w:vAlign w:val="center"/>
+          </w:tcPr>
+          <w:p>
+            <w:pPr>
+              <w:jc w:val="left"/>
+            </w:pPr>
+            <w:r>
+              <w:rPr>
+                <w:rFonts w:ascii="Calibri" w:cs="Calibri" w:eastAsia="Calibri" w:hAnsi="Calibri"/>
+                <w:b w:val="false"/>
+                <w:bCs w:val="false"/>
+                <w:color w:val="1F2937"/>
+                <w:sz w:val="20"/>
+                <w:szCs w:val="20"/>
+              </w:rPr>
+              <w:t xml:space="preserve">Implementation time</w:t>
+            </w:r>
+          </w:p>
+        </w:tc>
+        <w:tc>
+          <w:tcPr>
+            <w:tcW w:type="dxa" w:w="2650"/>
+            <w:shd w:fill="FFFFFF" w:val="clear"/>
+            <w:tcMar>
+              <w:top w:type="dxa" w:w="100"/>
+              <w:left w:type="dxa" w:w="140"/>
+              <w:bottom w:type="dxa" w:w="100"/>
+              <w:right w:type="dxa" w:w="140"/>
+            </w:tcMar>
+            <w:vAlign w:val="center"/>
+          </w:tcPr>
+          <w:p>
+            <w:pPr>
+              <w:jc w:val="left"/>
+            </w:pPr>
+            <w:r>
+              <w:rPr>
+                <w:rFonts w:ascii="Calibri" w:cs="Calibri" w:eastAsia="Calibri" w:hAnsi="Calibri"/>
+                <w:b w:val="false"/>
+                <w:bCs w:val="false"/>
+                <w:color w:val="1F2937"/>
+                <w:sz w:val="20"/>
+                <w:szCs w:val="20"/>
+              </w:rPr>
+              <w:t xml:space="preserve">Fastest — reuses an existing workflow engine</w:t>
+            </w:r>
+          </w:p>
+        </w:tc>
+        <w:tc>
+          <w:tcPr>
+            <w:tcW w:type="dxa" w:w="2650"/>
+            <w:shd w:fill="FFFFFF" w:val="clear"/>
+            <w:tcMar>
+              <w:top w:type="dxa" w:w="100"/>
+              <w:left w:type="dxa" w:w="140"/>
+              <w:bottom w:type="dxa" w:w="100"/>
+              <w:right w:type="dxa" w:w="140"/>
+            </w:tcMar>
+            <w:vAlign w:val="center"/>
+          </w:tcPr>
+          <w:p>
+            <w:pPr>
+              <w:jc w:val="left"/>
+            </w:pPr>
+            <w:r>
+              <w:rPr>
+                <w:rFonts w:ascii="Calibri" w:cs="Calibri" w:eastAsia="Calibri" w:hAnsi="Calibri"/>
+                <w:b w:val="false"/>
+                <w:bCs w:val="false"/>
+                <w:color w:val="1F2937"/>
+                <w:sz w:val="20"/>
+                <w:szCs w:val="20"/>
+              </w:rPr>
+              <w:t xml:space="preserve">Medium — vendor configuration and integration</w:t>
+            </w:r>
+          </w:p>
+        </w:tc>
+        <w:tc>
+          <w:tcPr>
+            <w:tcW w:type="dxa" w:w="2650"/>
+            <w:shd w:fill="FFFFFF" w:val="clear"/>
+            <w:tcMar>
+              <w:top w:type="dxa" w:w="100"/>
+              <w:left w:type="dxa" w:w="140"/>
+              <w:bottom w:type="dxa" w:w="100"/>
+              <w:right w:type="dxa" w:w="140"/>
+            </w:tcMar>
+            <w:vAlign w:val="center"/>
+          </w:tcPr>
+          <w:p>
+            <w:pPr>
+              <w:jc w:val="left"/>
+            </w:pPr>
+            <w:r>
+              <w:rPr>
+                <w:rFonts w:ascii="Calibri" w:cs="Calibri" w:eastAsia="Calibri" w:hAnsi="Calibri"/>
+                <w:b w:val="false"/>
+                <w:bCs w:val="false"/>
+                <w:color w:val="1F2937"/>
+                <w:sz w:val="20"/>
+                <w:szCs w:val="20"/>
+              </w:rPr>
+              <w:t xml:space="preserve">Slowest to first value, but sequenced entirely on the org's own priorities</w:t>
+            </w:r>
+          </w:p>
+        </w:tc>
+      </w:tr>
+      <w:tr>
+        <w:tc>
+          <w:tcPr>
+            <w:tcW w:type="dxa" w:w="1650"/>
+            <w:shd w:fill="F3F6F8" w:val="clear"/>
+            <w:tcMar>
+              <w:top w:type="dxa" w:w="100"/>
+              <w:left w:type="dxa" w:w="140"/>
+              <w:bottom w:type="dxa" w:w="100"/>
+              <w:right w:type="dxa" w:w="140"/>
+            </w:tcMar>
+            <w:vAlign w:val="center"/>
+          </w:tcPr>
+          <w:p>
+            <w:pPr>
+              <w:jc w:val="left"/>
+            </w:pPr>
+            <w:r>
+              <w:rPr>
+                <w:rFonts w:ascii="Calibri" w:cs="Calibri" w:eastAsia="Calibri" w:hAnsi="Calibri"/>
+                <w:b w:val="false"/>
+                <w:bCs w:val="false"/>
+                <w:color w:val="1F2937"/>
+                <w:sz w:val="20"/>
+                <w:szCs w:val="20"/>
+              </w:rPr>
+              <w:t xml:space="preserve">Cost profile</w:t>
+            </w:r>
+          </w:p>
+        </w:tc>
+        <w:tc>
+          <w:tcPr>
+            <w:tcW w:type="dxa" w:w="2650"/>
+            <w:shd w:fill="F3F6F8" w:val="clear"/>
+            <w:tcMar>
+              <w:top w:type="dxa" w:w="100"/>
+              <w:left w:type="dxa" w:w="140"/>
+              <w:bottom w:type="dxa" w:w="100"/>
+              <w:right w:type="dxa" w:w="140"/>
+            </w:tcMar>
+            <w:vAlign w:val="center"/>
+          </w:tcPr>
+          <w:p>
+            <w:pPr>
+              <w:jc w:val="left"/>
+            </w:pPr>
+            <w:r>
+              <w:rPr>
+                <w:rFonts w:ascii="Calibri" w:cs="Calibri" w:eastAsia="Calibri" w:hAnsi="Calibri"/>
+                <w:b w:val="false"/>
+                <w:bCs w:val="false"/>
+                <w:color w:val="1F2937"/>
+                <w:sz w:val="20"/>
+                <w:szCs w:val="20"/>
+              </w:rPr>
+              <w:t xml:space="preserve">Lowest incremental — licensing already sunk</w:t>
+            </w:r>
+          </w:p>
+        </w:tc>
+        <w:tc>
+          <w:tcPr>
+            <w:tcW w:type="dxa" w:w="2650"/>
+            <w:shd w:fill="F3F6F8" w:val="clear"/>
+            <w:tcMar>
+              <w:top w:type="dxa" w:w="100"/>
+              <w:left w:type="dxa" w:w="140"/>
+              <w:bottom w:type="dxa" w:w="100"/>
+              <w:right w:type="dxa" w:w="140"/>
+            </w:tcMar>
+            <w:vAlign w:val="center"/>
+          </w:tcPr>
+          <w:p>
+            <w:pPr>
+              <w:jc w:val="left"/>
+            </w:pPr>
+            <w:r>
+              <w:rPr>
+                <w:rFonts w:ascii="Calibri" w:cs="Calibri" w:eastAsia="Calibri" w:hAnsi="Calibri"/>
+                <w:b w:val="false"/>
+                <w:bCs w:val="false"/>
+                <w:color w:val="1F2937"/>
+                <w:sz w:val="20"/>
+                <w:szCs w:val="20"/>
+              </w:rPr>
+              <w:t xml:space="preserve">Recurring license, often per-seat or per-model</w:t>
+            </w:r>
+          </w:p>
+        </w:tc>
+        <w:tc>
+          <w:tcPr>
+            <w:tcW w:type="dxa" w:w="2650"/>
+            <w:shd w:fill="F3F6F8" w:val="clear"/>
+            <w:tcMar>
+              <w:top w:type="dxa" w:w="100"/>
+              <w:left w:type="dxa" w:w="140"/>
+              <w:bottom w:type="dxa" w:w="100"/>
+              <w:right w:type="dxa" w:w="140"/>
+            </w:tcMar>
+            <w:vAlign w:val="center"/>
+          </w:tcPr>
+          <w:p>
+            <w:pPr>
+              <w:jc w:val="left"/>
+            </w:pPr>
+            <w:r>
+              <w:rPr>
+                <w:rFonts w:ascii="Calibri" w:cs="Calibri" w:eastAsia="Calibri" w:hAnsi="Calibri"/>
+                <w:b w:val="false"/>
+                <w:bCs w:val="false"/>
+                <w:color w:val="1F2937"/>
+                <w:sz w:val="20"/>
+                <w:szCs w:val="20"/>
+              </w:rPr>
+              <w:t xml:space="preserve">Upfront engineering investment; no license, but ongoing internal ownership</w:t>
+            </w:r>
+          </w:p>
+        </w:tc>
+      </w:tr>
+      <w:tr>
+        <w:tc>
+          <w:tcPr>
+            <w:tcW w:type="dxa" w:w="1650"/>
+            <w:shd w:fill="FFFFFF" w:val="clear"/>
+            <w:tcMar>
+              <w:top w:type="dxa" w:w="100"/>
+              <w:left w:type="dxa" w:w="140"/>
+              <w:bottom w:type="dxa" w:w="100"/>
+              <w:right w:type="dxa" w:w="140"/>
+            </w:tcMar>
+            <w:vAlign w:val="center"/>
+          </w:tcPr>
+          <w:p>
+            <w:pPr>
+              <w:jc w:val="left"/>
+            </w:pPr>
+            <w:r>
+              <w:rPr>
+                <w:rFonts w:ascii="Calibri" w:cs="Calibri" w:eastAsia="Calibri" w:hAnsi="Calibri"/>
+                <w:b w:val="false"/>
+                <w:bCs w:val="false"/>
+                <w:color w:val="1F2937"/>
+                <w:sz w:val="20"/>
+                <w:szCs w:val="20"/>
+              </w:rPr>
+              <w:t xml:space="preserve">Integration complexity</w:t>
+            </w:r>
+          </w:p>
+        </w:tc>
+        <w:tc>
+          <w:tcPr>
+            <w:tcW w:type="dxa" w:w="2650"/>
+            <w:shd w:fill="FFFFFF" w:val="clear"/>
+            <w:tcMar>
+              <w:top w:type="dxa" w:w="100"/>
+              <w:left w:type="dxa" w:w="140"/>
+              <w:bottom w:type="dxa" w:w="100"/>
+              <w:right w:type="dxa" w:w="140"/>
+            </w:tcMar>
+            <w:vAlign w:val="center"/>
+          </w:tcPr>
+          <w:p>
+            <w:pPr>
+              <w:jc w:val="left"/>
+            </w:pPr>
+            <w:r>
+              <w:rPr>
+                <w:rFonts w:ascii="Calibri" w:cs="Calibri" w:eastAsia="Calibri" w:hAnsi="Calibri"/>
+                <w:b w:val="false"/>
+                <w:bCs w:val="false"/>
+                <w:color w:val="1F2937"/>
+                <w:sz w:val="20"/>
+                <w:szCs w:val="20"/>
+              </w:rPr>
+              <w:t xml:space="preserve">Low for the platform itself, but AI-specific runtime concepts (live kill-switch, streaming execution, real tool-call audit) are not native to it</w:t>
+            </w:r>
+          </w:p>
+        </w:tc>
+        <w:tc>
+          <w:tcPr>
+            <w:tcW w:type="dxa" w:w="2650"/>
+            <w:shd w:fill="FFFFFF" w:val="clear"/>
+            <w:tcMar>
+              <w:top w:type="dxa" w:w="100"/>
+              <w:left w:type="dxa" w:w="140"/>
+              <w:bottom w:type="dxa" w:w="100"/>
+              <w:right w:type="dxa" w:w="140"/>
+            </w:tcMar>
+            <w:vAlign w:val="center"/>
+          </w:tcPr>
+          <w:p>
+            <w:pPr>
+              <w:jc w:val="left"/>
+            </w:pPr>
+            <w:r>
+              <w:rPr>
+                <w:rFonts w:ascii="Calibri" w:cs="Calibri" w:eastAsia="Calibri" w:hAnsi="Calibri"/>
+                <w:b w:val="false"/>
+                <w:bCs w:val="false"/>
+                <w:color w:val="1F2937"/>
+                <w:sz w:val="20"/>
+                <w:szCs w:val="20"/>
+              </w:rPr>
+              <w:t xml:space="preserve">Medium-high — must integrate with the org's own AI Gateway, which the vendor did not design around</w:t>
+            </w:r>
+          </w:p>
+        </w:tc>
+        <w:tc>
+          <w:tcPr>
+            <w:tcW w:type="dxa" w:w="2650"/>
+            <w:shd w:fill="FFFFFF" w:val="clear"/>
+            <w:tcMar>
+              <w:top w:type="dxa" w:w="100"/>
+              <w:left w:type="dxa" w:w="140"/>
+              <w:bottom w:type="dxa" w:w="100"/>
+              <w:right w:type="dxa" w:w="140"/>
+            </w:tcMar>
+            <w:vAlign w:val="center"/>
+          </w:tcPr>
+          <w:p>
+            <w:pPr>
+              <w:jc w:val="left"/>
+            </w:pPr>
+            <w:r>
+              <w:rPr>
+                <w:rFonts w:ascii="Calibri" w:cs="Calibri" w:eastAsia="Calibri" w:hAnsi="Calibri"/>
+                <w:b w:val="false"/>
+                <w:bCs w:val="false"/>
+                <w:color w:val="1F2937"/>
+                <w:sz w:val="20"/>
+                <w:szCs w:val="20"/>
+              </w:rPr>
+              <w:t xml:space="preserve">Low, by construction — the platform is designed natively around the org's real AI Gateway and execution engine</w:t>
+            </w:r>
+          </w:p>
+        </w:tc>
+      </w:tr>
+      <w:tr>
+        <w:tc>
+          <w:tcPr>
+            <w:tcW w:type="dxa" w:w="1650"/>
+            <w:shd w:fill="F3F6F8" w:val="clear"/>
+            <w:tcMar>
+              <w:top w:type="dxa" w:w="100"/>
+              <w:left w:type="dxa" w:w="140"/>
+              <w:bottom w:type="dxa" w:w="100"/>
+              <w:right w:type="dxa" w:w="140"/>
+            </w:tcMar>
+            <w:vAlign w:val="center"/>
+          </w:tcPr>
+          <w:p>
+            <w:pPr>
+              <w:jc w:val="left"/>
+            </w:pPr>
+            <w:r>
+              <w:rPr>
+                <w:rFonts w:ascii="Calibri" w:cs="Calibri" w:eastAsia="Calibri" w:hAnsi="Calibri"/>
+                <w:b w:val="false"/>
+                <w:bCs w:val="false"/>
+                <w:color w:val="1F2937"/>
+                <w:sz w:val="20"/>
+                <w:szCs w:val="20"/>
+              </w:rPr>
+              <w:t xml:space="preserve">Flexibility</w:t>
+            </w:r>
+          </w:p>
+        </w:tc>
+        <w:tc>
+          <w:tcPr>
+            <w:tcW w:type="dxa" w:w="2650"/>
+            <w:shd w:fill="F3F6F8" w:val="clear"/>
+            <w:tcMar>
+              <w:top w:type="dxa" w:w="100"/>
+              <w:left w:type="dxa" w:w="140"/>
+              <w:bottom w:type="dxa" w:w="100"/>
+              <w:right w:type="dxa" w:w="140"/>
+            </w:tcMar>
+            <w:vAlign w:val="center"/>
+          </w:tcPr>
+          <w:p>
+            <w:pPr>
+              <w:jc w:val="left"/>
+            </w:pPr>
+            <w:r>
+              <w:rPr>
+                <w:rFonts w:ascii="Calibri" w:cs="Calibri" w:eastAsia="Calibri" w:hAnsi="Calibri"/>
+                <w:b w:val="false"/>
+                <w:bCs w:val="false"/>
+                <w:color w:val="1F2937"/>
+                <w:sz w:val="20"/>
+                <w:szCs w:val="20"/>
+              </w:rPr>
+              <w:t xml:space="preserve">Constrained to the host platform's workflow and data model</w:t>
+            </w:r>
+          </w:p>
+        </w:tc>
+        <w:tc>
+          <w:tcPr>
+            <w:tcW w:type="dxa" w:w="2650"/>
+            <w:shd w:fill="F3F6F8" w:val="clear"/>
+            <w:tcMar>
+              <w:top w:type="dxa" w:w="100"/>
+              <w:left w:type="dxa" w:w="140"/>
+              <w:bottom w:type="dxa" w:w="100"/>
+              <w:right w:type="dxa" w:w="140"/>
+            </w:tcMar>
+            <w:vAlign w:val="center"/>
+          </w:tcPr>
+          <w:p>
+            <w:pPr>
+              <w:jc w:val="left"/>
+            </w:pPr>
+            <w:r>
+              <w:rPr>
+                <w:rFonts w:ascii="Calibri" w:cs="Calibri" w:eastAsia="Calibri" w:hAnsi="Calibri"/>
+                <w:b w:val="false"/>
+                <w:bCs w:val="false"/>
+                <w:color w:val="1F2937"/>
+                <w:sz w:val="20"/>
+                <w:szCs w:val="20"/>
+              </w:rPr>
+              <w:t xml:space="preserve">Configurable within the vendor's model; core logic is vendor-owned</w:t>
+            </w:r>
+          </w:p>
+        </w:tc>
+        <w:tc>
+          <w:tcPr>
+            <w:tcW w:type="dxa" w:w="2650"/>
+            <w:shd w:fill="F3F6F8" w:val="clear"/>
+            <w:tcMar>
+              <w:top w:type="dxa" w:w="100"/>
+              <w:left w:type="dxa" w:w="140"/>
+              <w:bottom w:type="dxa" w:w="100"/>
+              <w:right w:type="dxa" w:w="140"/>
+            </w:tcMar>
+            <w:vAlign w:val="center"/>
+          </w:tcPr>
+          <w:p>
+            <w:pPr>
+              <w:jc w:val="left"/>
+            </w:pPr>
+            <w:r>
+              <w:rPr>
+                <w:rFonts w:ascii="Calibri" w:cs="Calibri" w:eastAsia="Calibri" w:hAnsi="Calibri"/>
+                <w:b w:val="false"/>
+                <w:bCs w:val="false"/>
+                <w:color w:val="1F2937"/>
+                <w:sz w:val="20"/>
+                <w:szCs w:val="20"/>
+              </w:rPr>
+              <w:t xml:space="preserve">Highest — every control and workflow can be shaped exactly to the org</w:t>
+            </w:r>
+          </w:p>
+        </w:tc>
+      </w:tr>
+      <w:tr>
+        <w:tc>
+          <w:tcPr>
+            <w:tcW w:type="dxa" w:w="1650"/>
+            <w:shd w:fill="FFFFFF" w:val="clear"/>
+            <w:tcMar>
+              <w:top w:type="dxa" w:w="100"/>
+              <w:left w:type="dxa" w:w="140"/>
+              <w:bottom w:type="dxa" w:w="100"/>
+              <w:right w:type="dxa" w:w="140"/>
+            </w:tcMar>
+            <w:vAlign w:val="center"/>
+          </w:tcPr>
+          <w:p>
+            <w:pPr>
+              <w:jc w:val="left"/>
+            </w:pPr>
+            <w:r>
+              <w:rPr>
+                <w:rFonts w:ascii="Calibri" w:cs="Calibri" w:eastAsia="Calibri" w:hAnsi="Calibri"/>
+                <w:b w:val="false"/>
+                <w:bCs w:val="false"/>
+                <w:color w:val="1F2937"/>
+                <w:sz w:val="20"/>
+                <w:szCs w:val="20"/>
+              </w:rPr>
+              <w:t xml:space="preserve">Operational ownership</w:t>
+            </w:r>
+          </w:p>
+        </w:tc>
+        <w:tc>
+          <w:tcPr>
+            <w:tcW w:type="dxa" w:w="2650"/>
+            <w:shd w:fill="FFFFFF" w:val="clear"/>
+            <w:tcMar>
+              <w:top w:type="dxa" w:w="100"/>
+              <w:left w:type="dxa" w:w="140"/>
+              <w:bottom w:type="dxa" w:w="100"/>
+              <w:right w:type="dxa" w:w="140"/>
+            </w:tcMar>
+            <w:vAlign w:val="center"/>
+          </w:tcPr>
+          <w:p>
+            <w:pPr>
+              <w:jc w:val="left"/>
+            </w:pPr>
+            <w:r>
+              <w:rPr>
+                <w:rFonts w:ascii="Calibri" w:cs="Calibri" w:eastAsia="Calibri" w:hAnsi="Calibri"/>
+                <w:b w:val="false"/>
+                <w:bCs w:val="false"/>
+                <w:color w:val="1F2937"/>
+                <w:sz w:val="20"/>
+                <w:szCs w:val="20"/>
+              </w:rPr>
+              <w:t xml:space="preserve">Existing GRC/ITSM team; no new team required</w:t>
+            </w:r>
+          </w:p>
+        </w:tc>
+        <w:tc>
+          <w:tcPr>
+            <w:tcW w:type="dxa" w:w="2650"/>
+            <w:shd w:fill="FFFFFF" w:val="clear"/>
+            <w:tcMar>
+              <w:top w:type="dxa" w:w="100"/>
+              <w:left w:type="dxa" w:w="140"/>
+              <w:bottom w:type="dxa" w:w="100"/>
+              <w:right w:type="dxa" w:w="140"/>
+            </w:tcMar>
+            <w:vAlign w:val="center"/>
+          </w:tcPr>
+          <w:p>
+            <w:pPr>
+              <w:jc w:val="left"/>
+            </w:pPr>
+            <w:r>
+              <w:rPr>
+                <w:rFonts w:ascii="Calibri" w:cs="Calibri" w:eastAsia="Calibri" w:hAnsi="Calibri"/>
+                <w:b w:val="false"/>
+                <w:bCs w:val="false"/>
+                <w:color w:val="1F2937"/>
+                <w:sz w:val="20"/>
+                <w:szCs w:val="20"/>
+              </w:rPr>
+              <w:t xml:space="preserve">New vendor relationship, plus an internal team to map the org's risk taxonomy onto it</w:t>
+            </w:r>
+          </w:p>
+        </w:tc>
+        <w:tc>
+          <w:tcPr>
+            <w:tcW w:type="dxa" w:w="2650"/>
+            <w:shd w:fill="FFFFFF" w:val="clear"/>
+            <w:tcMar>
+              <w:top w:type="dxa" w:w="100"/>
+              <w:left w:type="dxa" w:w="140"/>
+              <w:bottom w:type="dxa" w:w="100"/>
+              <w:right w:type="dxa" w:w="140"/>
+            </w:tcMar>
+            <w:vAlign w:val="center"/>
+          </w:tcPr>
+          <w:p>
+            <w:pPr>
+              <w:jc w:val="left"/>
+            </w:pPr>
+            <w:r>
+              <w:rPr>
+                <w:rFonts w:ascii="Calibri" w:cs="Calibri" w:eastAsia="Calibri" w:hAnsi="Calibri"/>
+                <w:b w:val="false"/>
+                <w:bCs w:val="false"/>
+                <w:color w:val="1F2937"/>
+                <w:sz w:val="20"/>
+                <w:szCs w:val="20"/>
+              </w:rPr>
+              <w:t xml:space="preserve">A new internal platform team, required to build and to run it long-term</w:t>
+            </w:r>
+          </w:p>
+        </w:tc>
+      </w:tr>
+      <w:tr>
+        <w:tc>
+          <w:tcPr>
+            <w:tcW w:type="dxa" w:w="1650"/>
+            <w:shd w:fill="F3F6F8" w:val="clear"/>
+            <w:tcMar>
+              <w:top w:type="dxa" w:w="100"/>
+              <w:left w:type="dxa" w:w="140"/>
+              <w:bottom w:type="dxa" w:w="100"/>
+              <w:right w:type="dxa" w:w="140"/>
+            </w:tcMar>
+            <w:vAlign w:val="center"/>
+          </w:tcPr>
+          <w:p>
+            <w:pPr>
+              <w:jc w:val="left"/>
+            </w:pPr>
+            <w:r>
+              <w:rPr>
+                <w:rFonts w:ascii="Calibri" w:cs="Calibri" w:eastAsia="Calibri" w:hAnsi="Calibri"/>
+                <w:b w:val="false"/>
+                <w:bCs w:val="false"/>
+                <w:color w:val="1F2937"/>
+                <w:sz w:val="20"/>
+                <w:szCs w:val="20"/>
+              </w:rPr>
+              <w:t xml:space="preserve">Regulatory control</w:t>
+            </w:r>
+          </w:p>
+        </w:tc>
+        <w:tc>
+          <w:tcPr>
+            <w:tcW w:type="dxa" w:w="2650"/>
+            <w:shd w:fill="F3F6F8" w:val="clear"/>
+            <w:tcMar>
+              <w:top w:type="dxa" w:w="100"/>
+              <w:left w:type="dxa" w:w="140"/>
+              <w:bottom w:type="dxa" w:w="100"/>
+              <w:right w:type="dxa" w:w="140"/>
+            </w:tcMar>
+            <w:vAlign w:val="center"/>
+          </w:tcPr>
+          <w:p>
+            <w:pPr>
+              <w:jc w:val="left"/>
+            </w:pPr>
+            <w:r>
+              <w:rPr>
+                <w:rFonts w:ascii="Calibri" w:cs="Calibri" w:eastAsia="Calibri" w:hAnsi="Calibri"/>
+                <w:b w:val="false"/>
+                <w:bCs w:val="false"/>
+                <w:color w:val="1F2937"/>
+                <w:sz w:val="20"/>
+                <w:szCs w:val="20"/>
+              </w:rPr>
+              <w:t xml:space="preserve">General-purpose control language, not AI-specific</w:t>
+            </w:r>
+          </w:p>
+        </w:tc>
+        <w:tc>
+          <w:tcPr>
+            <w:tcW w:type="dxa" w:w="2650"/>
+            <w:shd w:fill="F3F6F8" w:val="clear"/>
+            <w:tcMar>
+              <w:top w:type="dxa" w:w="100"/>
+              <w:left w:type="dxa" w:w="140"/>
+              <w:bottom w:type="dxa" w:w="100"/>
+              <w:right w:type="dxa" w:w="140"/>
+            </w:tcMar>
+            <w:vAlign w:val="center"/>
+          </w:tcPr>
+          <w:p>
+            <w:pPr>
+              <w:jc w:val="left"/>
+            </w:pPr>
+            <w:r>
+              <w:rPr>
+                <w:rFonts w:ascii="Calibri" w:cs="Calibri" w:eastAsia="Calibri" w:hAnsi="Calibri"/>
+                <w:b w:val="false"/>
+                <w:bCs w:val="false"/>
+                <w:color w:val="1F2937"/>
+                <w:sz w:val="20"/>
+                <w:szCs w:val="20"/>
+              </w:rPr>
+              <w:t xml:space="preserve">Often compliance-aware, but generic across industries</w:t>
+            </w:r>
+          </w:p>
+        </w:tc>
+        <w:tc>
+          <w:tcPr>
+            <w:tcW w:type="dxa" w:w="2650"/>
+            <w:shd w:fill="F3F6F8" w:val="clear"/>
+            <w:tcMar>
+              <w:top w:type="dxa" w:w="100"/>
+              <w:left w:type="dxa" w:w="140"/>
+              <w:bottom w:type="dxa" w:w="100"/>
+              <w:right w:type="dxa" w:w="140"/>
+            </w:tcMar>
+            <w:vAlign w:val="center"/>
+          </w:tcPr>
+          <w:p>
+            <w:pPr>
+              <w:jc w:val="left"/>
+            </w:pPr>
+            <w:r>
+              <w:rPr>
+                <w:rFonts w:ascii="Calibri" w:cs="Calibri" w:eastAsia="Calibri" w:hAnsi="Calibri"/>
+                <w:b w:val="false"/>
+                <w:bCs w:val="false"/>
+                <w:color w:val="1F2937"/>
+                <w:sz w:val="20"/>
+                <w:szCs w:val="20"/>
+              </w:rPr>
+              <w:t xml:space="preserve">Highest — controls can be mapped precisely to a specific regulation or clause (not yet built in EGPA — see Roadmap)</w:t>
+            </w:r>
+          </w:p>
+        </w:tc>
+      </w:tr>
+      <w:tr>
+        <w:tc>
+          <w:tcPr>
+            <w:tcW w:type="dxa" w:w="1650"/>
+            <w:shd w:fill="FFFFFF" w:val="clear"/>
+            <w:tcMar>
+              <w:top w:type="dxa" w:w="100"/>
+              <w:left w:type="dxa" w:w="140"/>
+              <w:bottom w:type="dxa" w:w="100"/>
+              <w:right w:type="dxa" w:w="140"/>
+            </w:tcMar>
+            <w:vAlign w:val="center"/>
+          </w:tcPr>
+          <w:p>
+            <w:pPr>
+              <w:jc w:val="left"/>
+            </w:pPr>
+            <w:r>
+              <w:rPr>
+                <w:rFonts w:ascii="Calibri" w:cs="Calibri" w:eastAsia="Calibri" w:hAnsi="Calibri"/>
+                <w:b w:val="false"/>
+                <w:bCs w:val="false"/>
+                <w:color w:val="1F2937"/>
+                <w:sz w:val="20"/>
+                <w:szCs w:val="20"/>
+              </w:rPr>
+              <w:t xml:space="preserve">Scalability</w:t>
+            </w:r>
+          </w:p>
+        </w:tc>
+        <w:tc>
+          <w:tcPr>
+            <w:tcW w:type="dxa" w:w="2650"/>
+            <w:shd w:fill="FFFFFF" w:val="clear"/>
+            <w:tcMar>
+              <w:top w:type="dxa" w:w="100"/>
+              <w:left w:type="dxa" w:w="140"/>
+              <w:bottom w:type="dxa" w:w="100"/>
+              <w:right w:type="dxa" w:w="140"/>
+            </w:tcMar>
+            <w:vAlign w:val="center"/>
+          </w:tcPr>
+          <w:p>
+            <w:pPr>
+              <w:jc w:val="left"/>
+            </w:pPr>
+            <w:r>
+              <w:rPr>
+                <w:rFonts w:ascii="Calibri" w:cs="Calibri" w:eastAsia="Calibri" w:hAnsi="Calibri"/>
+                <w:b w:val="false"/>
+                <w:bCs w:val="false"/>
+                <w:color w:val="1F2937"/>
+                <w:sz w:val="20"/>
+                <w:szCs w:val="20"/>
+              </w:rPr>
+              <w:t xml:space="preserve">Strong for approval-workflow volume; not built for real-time runtime supervision of a running agent</w:t>
+            </w:r>
+          </w:p>
+        </w:tc>
+        <w:tc>
+          <w:tcPr>
+            <w:tcW w:type="dxa" w:w="2650"/>
+            <w:shd w:fill="FFFFFF" w:val="clear"/>
+            <w:tcMar>
+              <w:top w:type="dxa" w:w="100"/>
+              <w:left w:type="dxa" w:w="140"/>
+              <w:bottom w:type="dxa" w:w="100"/>
+              <w:right w:type="dxa" w:w="140"/>
+            </w:tcMar>
+            <w:vAlign w:val="center"/>
+          </w:tcPr>
+          <w:p>
+            <w:pPr>
+              <w:jc w:val="left"/>
+            </w:pPr>
+            <w:r>
+              <w:rPr>
+                <w:rFonts w:ascii="Calibri" w:cs="Calibri" w:eastAsia="Calibri" w:hAnsi="Calibri"/>
+                <w:b w:val="false"/>
+                <w:bCs w:val="false"/>
+                <w:color w:val="1F2937"/>
+                <w:sz w:val="20"/>
+                <w:szCs w:val="20"/>
+              </w:rPr>
+              <w:t xml:space="preserve">Good, but bound to the vendor's own roadmap for AI-specific capability</w:t>
+            </w:r>
+          </w:p>
+        </w:tc>
+        <w:tc>
+          <w:tcPr>
+            <w:tcW w:type="dxa" w:w="2650"/>
+            <w:shd w:fill="FFFFFF" w:val="clear"/>
+            <w:tcMar>
+              <w:top w:type="dxa" w:w="100"/>
+              <w:left w:type="dxa" w:w="140"/>
+              <w:bottom w:type="dxa" w:w="100"/>
+              <w:right w:type="dxa" w:w="140"/>
+            </w:tcMar>
+            <w:vAlign w:val="center"/>
+          </w:tcPr>
+          <w:p>
+            <w:pPr>
+              <w:jc w:val="left"/>
+            </w:pPr>
+            <w:r>
+              <w:rPr>
+                <w:rFonts w:ascii="Calibri" w:cs="Calibri" w:eastAsia="Calibri" w:hAnsi="Calibri"/>
+                <w:b w:val="false"/>
+                <w:bCs w:val="false"/>
+                <w:color w:val="1F2937"/>
+                <w:sz w:val="20"/>
+                <w:szCs w:val="20"/>
+              </w:rPr>
+              <w:t xml:space="preserve">Purpose-built for the real-time enforcement (kill-switch, streaming, tool-call audit) the other two options don't natively support</w:t>
+            </w:r>
+          </w:p>
+        </w:tc>
+      </w:tr>
+    </w:tbl>
+    <w:p>
+      <w:pPr>
+        <w:pStyle w:val="Heading2"/>
+        <w:spacing w:after="140" w:before="320"/>
+      </w:pPr>
+      <w:r>
+        <w:rPr>
+          <w:rFonts w:ascii="Cambria" w:cs="Cambria" w:eastAsia="Cambria" w:hAnsi="Cambria"/>
+          <w:b/>
+          <w:bCs/>
+          <w:color w:val="0A2A43"/>
+          <w:sz w:val="24"/>
+          <w:szCs w:val="24"/>
+        </w:rPr>
+        <w:t xml:space="preserve">Build-versus-buy rationale</w:t>
+      </w:r>
+    </w:p>
+    <w:p>
+      <w:pPr>
+        <w:spacing w:after="160" w:line="288"/>
+      </w:pPr>
+      <w:r>
+        <w:rPr>
+          <w:rFonts w:ascii="Calibri" w:cs="Calibri" w:eastAsia="Calibri" w:hAnsi="Calibri"/>
+          <w:b/>
+          <w:bCs/>
+          <w:color w:val="1F2937"/>
+          <w:sz w:val="21"/>
+          <w:szCs w:val="21"/>
+        </w:rPr>
+        <w:t xml:space="preserve">Building EGPA is the right call specifically when:</w:t>
+      </w:r>
+    </w:p>
+    <w:p>
+      <w:pPr>
+        <w:pStyle w:val="ListParagraph"/>
+        <w:numPr>
+          <w:ilvl w:val="0"/>
+          <w:numId w:val="2"/>
+        </w:numPr>
+        <w:spacing w:after="90" w:line="276"/>
+      </w:pPr>
+      <w:r>
+        <w:rPr>
+          <w:rFonts w:ascii="Calibri" w:cs="Calibri" w:eastAsia="Calibri" w:hAnsi="Calibri"/>
+          <w:color w:val="1F2937"/>
+          <w:sz w:val="21"/>
+          <w:szCs w:val="21"/>
+        </w:rPr>
+        <w:t xml:space="preserve">Runtime enforcement is a hard requirement — a kill-switch that actually halts execution mid-run, live tool-call auditing, and real-time policy checks against a live AI Gateway. Existing GRC/ITSM tooling and most commercial AI-governance products are built for policy and approval workflow, not real-time intervention inside a running agent.</w:t>
+      </w:r>
+    </w:p>
+    <w:p>
+      <w:pPr>
+        <w:pStyle w:val="ListParagraph"/>
+        <w:numPr>
+          <w:ilvl w:val="0"/>
+          <w:numId w:val="2"/>
+        </w:numPr>
+        <w:spacing w:after="90" w:line="276"/>
+      </w:pPr>
+      <w:r>
+        <w:rPr>
+          <w:rFonts w:ascii="Calibri" w:cs="Calibri" w:eastAsia="Calibri" w:hAnsi="Calibri"/>
+          <w:color w:val="1F2937"/>
+          <w:sz w:val="21"/>
+          <w:szCs w:val="21"/>
+        </w:rPr>
+        <w:t xml:space="preserve">The organization already operates its own AI Gateway or model-serving infrastructure, and governance needs to be coupled tightly to it rather than bolted on afterward.</w:t>
+      </w:r>
+    </w:p>
+    <w:p>
+      <w:pPr>
+        <w:pStyle w:val="ListParagraph"/>
+        <w:numPr>
+          <w:ilvl w:val="0"/>
+          <w:numId w:val="2"/>
+        </w:numPr>
+        <w:spacing w:after="90" w:line="276"/>
+      </w:pPr>
+      <w:r>
+        <w:rPr>
+          <w:rFonts w:ascii="Calibri" w:cs="Calibri" w:eastAsia="Calibri" w:hAnsi="Calibri"/>
+          <w:color w:val="1F2937"/>
+          <w:sz w:val="21"/>
+          <w:szCs w:val="21"/>
+        </w:rPr>
+        <w:t xml:space="preserve">The organization's risk taxonomy is specific enough — federated business units, multiple regulatory regimes — that a generic product's configuration ceiling would be reached quickly.</w:t>
+      </w:r>
+    </w:p>
+    <w:p>
+      <w:pPr>
+        <w:pStyle w:val="ListParagraph"/>
+        <w:numPr>
+          <w:ilvl w:val="0"/>
+          <w:numId w:val="2"/>
+        </w:numPr>
+        <w:spacing w:after="90" w:line="276"/>
+      </w:pPr>
+      <w:r>
+        <w:rPr>
+          <w:rFonts w:ascii="Calibri" w:cs="Calibri" w:eastAsia="Calibri" w:hAnsi="Calibri"/>
+          <w:color w:val="1F2937"/>
+          <w:sz w:val="21"/>
+          <w:szCs w:val="21"/>
+        </w:rPr>
+        <w:t xml:space="preserve">The organization has genuine, sustained platform-engineering capacity to build and maintain it — the real ongoing cost of "build" is the maintenance commitment, not just the initial construction.</w:t>
+      </w:r>
+    </w:p>
+    <w:p>
+      <w:pPr>
+        <w:spacing w:after="160" w:line="288"/>
+      </w:pPr>
+      <w:r>
+        <w:rPr>
+          <w:rFonts w:ascii="Calibri" w:cs="Calibri" w:eastAsia="Calibri" w:hAnsi="Calibri"/>
+          <w:b/>
+          <w:bCs/>
+          <w:color w:val="1F2937"/>
+          <w:sz w:val="21"/>
+          <w:szCs w:val="21"/>
+        </w:rPr>
+        <w:t xml:space="preserve">Buying or extending is the right call instead when:</w:t>
+      </w:r>
+    </w:p>
+    <w:p>
+      <w:pPr>
+        <w:pStyle w:val="ListParagraph"/>
+        <w:numPr>
+          <w:ilvl w:val="0"/>
+          <w:numId w:val="2"/>
+        </w:numPr>
+        <w:spacing w:after="90" w:line="276"/>
+      </w:pPr>
+      <w:r>
+        <w:rPr>
+          <w:rFonts w:ascii="Calibri" w:cs="Calibri" w:eastAsia="Calibri" w:hAnsi="Calibri"/>
+          <w:color w:val="1F2937"/>
+          <w:sz w:val="21"/>
+          <w:szCs w:val="21"/>
+        </w:rPr>
+        <w:t xml:space="preserve">AI initiatives are early-stage or low-volume, and a lightweight extension of existing GRC/ITSM tooling is enough to establish basic oversight without a new platform investment.</w:t>
+      </w:r>
+    </w:p>
+    <w:p>
+      <w:pPr>
+        <w:pStyle w:val="ListParagraph"/>
+        <w:numPr>
+          <w:ilvl w:val="0"/>
+          <w:numId w:val="2"/>
+        </w:numPr>
+        <w:spacing w:after="90" w:line="276"/>
+      </w:pPr>
+      <w:r>
+        <w:rPr>
+          <w:rFonts w:ascii="Calibri" w:cs="Calibri" w:eastAsia="Calibri" w:hAnsi="Calibri"/>
+          <w:color w:val="1F2937"/>
+          <w:sz w:val="21"/>
+          <w:szCs w:val="21"/>
+        </w:rPr>
+        <w:t xml:space="preserve">There is no in-house AI Gateway or execution substrate to govern yet — with nothing running, there is nothing for a build like EGPA to attach to, and a policy-and-approval product may be sufficient on its own.</w:t>
+      </w:r>
+    </w:p>
+    <w:p>
+      <w:pPr>
+        <w:pStyle w:val="ListParagraph"/>
+        <w:numPr>
+          <w:ilvl w:val="0"/>
+          <w:numId w:val="2"/>
+        </w:numPr>
+        <w:spacing w:after="90" w:line="276"/>
+      </w:pPr>
+      <w:r>
+        <w:rPr>
+          <w:rFonts w:ascii="Calibri" w:cs="Calibri" w:eastAsia="Calibri" w:hAnsi="Calibri"/>
+          <w:color w:val="1F2937"/>
+          <w:sz w:val="21"/>
+          <w:szCs w:val="21"/>
+        </w:rPr>
+        <w:t xml:space="preserve">Speed to basic governance matters more than depth — procuring an established product gets some real oversight in place fastest, even if it is not tailored.</w:t>
+      </w:r>
+    </w:p>
+    <w:p>
+      <w:pPr>
+        <w:pStyle w:val="ListParagraph"/>
+        <w:numPr>
+          <w:ilvl w:val="0"/>
+          <w:numId w:val="2"/>
+        </w:numPr>
+        <w:spacing w:after="90" w:line="276"/>
+      </w:pPr>
+      <w:r>
+        <w:rPr>
+          <w:rFonts w:ascii="Calibri" w:cs="Calibri" w:eastAsia="Calibri" w:hAnsi="Calibri"/>
+          <w:color w:val="1F2937"/>
+          <w:sz w:val="21"/>
+          <w:szCs w:val="21"/>
+        </w:rPr>
+        <w:t xml:space="preserve">The organization lacks the sustained platform-engineering capacity a bespoke system requires to stay maintained, not just built.</w:t>
+      </w:r>
+    </w:p>
+    <w:p>
+      <w:pPr>
+        <w:pStyle w:val="Heading2"/>
+        <w:spacing w:after="140" w:before="320"/>
+      </w:pPr>
+      <w:r>
+        <w:rPr>
+          <w:rFonts w:ascii="Cambria" w:cs="Cambria" w:eastAsia="Cambria" w:hAnsi="Cambria"/>
+          <w:b/>
+          <w:bCs/>
+          <w:color w:val="0A2A43"/>
+          <w:sz w:val="24"/>
+          <w:szCs w:val="24"/>
+        </w:rPr>
+        <w:t xml:space="preserve">Current state to target state</w:t>
+      </w:r>
+    </w:p>
+    <w:p>
+      <w:pPr>
+        <w:spacing w:after="160" w:line="288"/>
+      </w:pPr>
+      <w:r>
+        <w:rPr>
+          <w:rFonts w:ascii="Calibri" w:cs="Calibri" w:eastAsia="Calibri" w:hAnsi="Calibri"/>
+          <w:color w:val="1F2937"/>
+          <w:sz w:val="21"/>
+          <w:szCs w:val="21"/>
+        </w:rPr>
+        <w:t xml:space="preserve">A real adopting organization would not cut over in one step. An incremental path that avoids disrupting what already works:</w:t>
+      </w:r>
+    </w:p>
+    <w:p>
+      <w:pPr>
+        <w:pStyle w:val="ListParagraph"/>
+        <w:numPr>
+          <w:ilvl w:val="0"/>
+          <w:numId w:val="2"/>
+        </w:numPr>
+        <w:spacing w:after="90" w:line="276"/>
+      </w:pPr>
+      <w:r>
+        <w:rPr>
+          <w:rFonts w:ascii="Calibri" w:cs="Calibri" w:eastAsia="Calibri" w:hAnsi="Calibri"/>
+          <w:color w:val="1F2937"/>
+          <w:sz w:val="21"/>
+          <w:szCs w:val="21"/>
+        </w:rPr>
+        <w:t xml:space="preserve">Stage 0 — Current state. AI use cases built ad hoc across business units; no centralized risk scoring; approvals happen informally over email, chat, or meetings; no consistent audit trail; existing GRC/ITSM tooling not extended for AI-specific concerns.</w:t>
+      </w:r>
+    </w:p>
+    <w:p>
+      <w:pPr>
+        <w:pStyle w:val="ListParagraph"/>
+        <w:numPr>
+          <w:ilvl w:val="0"/>
+          <w:numId w:val="2"/>
+        </w:numPr>
+        <w:spacing w:after="90" w:line="276"/>
+      </w:pPr>
+      <w:r>
+        <w:rPr>
+          <w:rFonts w:ascii="Calibri" w:cs="Calibri" w:eastAsia="Calibri" w:hAnsi="Calibri"/>
+          <w:color w:val="1F2937"/>
+          <w:sz w:val="21"/>
+          <w:szCs w:val="21"/>
+        </w:rPr>
+        <w:t xml:space="preserve">Stage 1 — New use cases only. Route new AI use cases through Discovery, Intake, Recommendation, and Gate, alongside whatever already exists. In-flight and already-built use cases are not force-migrated — this establishes a real risk score and a real audit trail for anything new without disrupting anything running.</w:t>
+      </w:r>
+    </w:p>
+    <w:p>
+      <w:pPr>
+        <w:pStyle w:val="ListParagraph"/>
+        <w:numPr>
+          <w:ilvl w:val="0"/>
+          <w:numId w:val="2"/>
+        </w:numPr>
+        <w:spacing w:after="90" w:line="276"/>
+      </w:pPr>
+      <w:r>
+        <w:rPr>
+          <w:rFonts w:ascii="Calibri" w:cs="Calibri" w:eastAsia="Calibri" w:hAnsi="Calibri"/>
+          <w:color w:val="1F2937"/>
+          <w:sz w:val="21"/>
+          <w:szCs w:val="21"/>
+        </w:rPr>
+        <w:t xml:space="preserve">Stage 2 — Retroactive governance for what already exists. Route existing high-risk or Critical-tier use cases through the Gate for a real governance record, using the preflight-check and declared-vs-actual reconciliation APIs so already-built agents get governed without being rebuilt.</w:t>
+      </w:r>
+    </w:p>
+    <w:p>
+      <w:pPr>
+        <w:pStyle w:val="ListParagraph"/>
+        <w:numPr>
+          <w:ilvl w:val="0"/>
+          <w:numId w:val="2"/>
+        </w:numPr>
+        <w:spacing w:after="90" w:line="276"/>
+      </w:pPr>
+      <w:r>
+        <w:rPr>
+          <w:rFonts w:ascii="Calibri" w:cs="Calibri" w:eastAsia="Calibri" w:hAnsi="Calibri"/>
+          <w:color w:val="1F2937"/>
+          <w:sz w:val="21"/>
+          <w:szCs w:val="21"/>
+        </w:rPr>
+        <w:t xml:space="preserve">Stage 3 — Bring validation in-house. Once teams trust the governance layer, use EGPA's own Agentic System execution engine to validate new agent builds before they go to their real production home.</w:t>
+      </w:r>
+    </w:p>
+    <w:p>
+      <w:pPr>
+        <w:pStyle w:val="ListParagraph"/>
+        <w:numPr>
+          <w:ilvl w:val="0"/>
+          <w:numId w:val="2"/>
+        </w:numPr>
+        <w:spacing w:after="90" w:line="276"/>
+      </w:pPr>
+      <w:r>
+        <w:rPr>
+          <w:rFonts w:ascii="Calibri" w:cs="Calibri" w:eastAsia="Calibri" w:hAnsi="Calibri"/>
+          <w:color w:val="1F2937"/>
+          <w:sz w:val="21"/>
+          <w:szCs w:val="21"/>
+        </w:rPr>
+        <w:t xml:space="preserve">Stage 4 — Consolidate. Fold in or retire legacy informal approval processes once EGPA's audit trail is trusted as the system of record; integrate with existing GRC/ITSM tooling for cross-referencing rather than duplicating records in both places.</w:t>
       </w:r>
     </w:p>
     <w:p>
@@ -2643,7 +4204,7 @@
           <w:sz w:val="21"/>
           <w:szCs w:val="21"/>
         </w:rPr>
-        <w:t xml:space="preserve">Observability tracks actual time and cost saved against an honestly declared baseline for each use case — not a marketing estimate. Every number on the platform's own dashboard is a live aggregate straight from Postgres, computed the same moment it is displayed. As of this document, the production instance had processed real executions with the following genuine, measured totals:</w:t>
+        <w:t xml:space="preserve">Observability and the Governance Posture page track actual outcomes against an honestly declared baseline — not marketing estimates. Every number below is a live aggregate straight from Postgres, computed the same moment it is displayed, pulled directly from the production instance:</w:t>
       </w:r>
     </w:p>
     <w:p>
@@ -2744,6 +4305,115 @@
           <w:szCs w:val="19"/>
         </w:rPr>
         <w:t xml:space="preserve">in real, metered spend across every model provider used</w:t>
+      </w:r>
+    </w:p>
+    <w:p>
+      <w:pPr>
+        <w:spacing w:after="160" w:line="288"/>
+      </w:pPr>
+      <w:r>
+        <w:rPr>
+          <w:rFonts w:ascii="Calibri" w:cs="Calibri" w:eastAsia="Calibri" w:hAnsi="Calibri"/>
+          <w:color w:val="1F2937"/>
+          <w:sz w:val="21"/>
+          <w:szCs w:val="21"/>
+        </w:rPr>
+        <w:t xml:space="preserve">Beyond raw execution volume, the platform connects directly to the outcome categories a real adoption case needs to justify itself against:</w:t>
+      </w:r>
+    </w:p>
+    <w:p>
+      <w:pPr>
+        <w:pStyle w:val="ListParagraph"/>
+        <w:numPr>
+          <w:ilvl w:val="0"/>
+          <w:numId w:val="2"/>
+        </w:numPr>
+        <w:spacing w:after="90" w:line="276"/>
+      </w:pPr>
+      <w:r>
+        <w:rPr>
+          <w:rFonts w:ascii="Calibri" w:cs="Calibri" w:eastAsia="Calibri" w:hAnsi="Calibri"/>
+          <w:color w:val="1F2937"/>
+          <w:sz w:val="21"/>
+          <w:szCs w:val="21"/>
+        </w:rPr>
+        <w:t xml:space="preserve">Reduced approval time — average 31.8 hours from Intake to Gate cleared, measured across every use case with a real approval timestamp, not the whole pipeline diluted by build time.</w:t>
+      </w:r>
+    </w:p>
+    <w:p>
+      <w:pPr>
+        <w:pStyle w:val="ListParagraph"/>
+        <w:numPr>
+          <w:ilvl w:val="0"/>
+          <w:numId w:val="2"/>
+        </w:numPr>
+        <w:spacing w:after="90" w:line="276"/>
+      </w:pPr>
+      <w:r>
+        <w:rPr>
+          <w:rFonts w:ascii="Calibri" w:cs="Calibri" w:eastAsia="Calibri" w:hAnsi="Calibri"/>
+          <w:color w:val="1F2937"/>
+          <w:sz w:val="21"/>
+          <w:szCs w:val="21"/>
+        </w:rPr>
+        <w:t xml:space="preserve">Improved reuse — 100% of concluded Discovery sessions recommended process-only, extend-existing, or research-first over building a new agent; real evidence the discovery gate is not a rubber stamp on the way to Intake.</w:t>
+      </w:r>
+    </w:p>
+    <w:p>
+      <w:pPr>
+        <w:pStyle w:val="ListParagraph"/>
+        <w:numPr>
+          <w:ilvl w:val="0"/>
+          <w:numId w:val="2"/>
+        </w:numPr>
+        <w:spacing w:after="90" w:line="276"/>
+      </w:pPr>
+      <w:r>
+        <w:rPr>
+          <w:rFonts w:ascii="Calibri" w:cs="Calibri" w:eastAsia="Calibri" w:hAnsi="Calibri"/>
+          <w:color w:val="1F2937"/>
+          <w:sz w:val="21"/>
+          <w:szCs w:val="21"/>
+        </w:rPr>
+        <w:t xml:space="preserve">Lower AI delivery cost — $399.15 in real cost saved against a declared baseline, across use cases with a set cost/hour.</w:t>
+      </w:r>
+    </w:p>
+    <w:p>
+      <w:pPr>
+        <w:pStyle w:val="ListParagraph"/>
+        <w:numPr>
+          <w:ilvl w:val="0"/>
+          <w:numId w:val="2"/>
+        </w:numPr>
+        <w:spacing w:after="90" w:line="276"/>
+      </w:pPr>
+      <w:r>
+        <w:rPr>
+          <w:rFonts w:ascii="Calibri" w:cs="Calibri" w:eastAsia="Calibri" w:hAnsi="Calibri"/>
+          <w:color w:val="1F2937"/>
+          <w:sz w:val="21"/>
+          <w:szCs w:val="21"/>
+        </w:rPr>
+        <w:t xml:space="preserve">Reduced compliance exposure — 9 real incidents caught and logged to the audit trail: PII detections, undeclared-tool incidents, preflight denials, and kill-switch engagements combined.</w:t>
+      </w:r>
+    </w:p>
+    <w:p>
+      <w:pPr>
+        <w:pStyle w:val="ListParagraph"/>
+        <w:numPr>
+          <w:ilvl w:val="0"/>
+          <w:numId w:val="2"/>
+        </w:numPr>
+        <w:spacing w:after="90" w:line="276"/>
+      </w:pPr>
+      <w:r>
+        <w:rPr>
+          <w:rFonts w:ascii="Calibri" w:cs="Calibri" w:eastAsia="Calibri" w:hAnsi="Calibri"/>
+          <w:color w:val="1F2937"/>
+          <w:sz w:val="21"/>
+          <w:szCs w:val="21"/>
+        </w:rPr>
+        <w:t xml:space="preserve">Faster movement into production — average 7.5 hours from Intake to first completed execution, across every use case that has actually run.</w:t>
       </w:r>
     </w:p>
     <w:p>
@@ -3485,6 +5155,295 @@
         </w:tc>
       </w:tr>
     </w:tbl>
+    <w:p>
+      <w:pPr>
+        <w:pStyle w:val="Heading1"/>
+        <w:pBdr>
+          <w:bottom w:val="single" w:color="1A9C94" w:sz="8" w:space="6"/>
+        </w:pBdr>
+        <w:spacing w:after="200" w:before="480"/>
+      </w:pPr>
+      <w:r>
+        <w:rPr>
+          <w:rFonts w:ascii="Cambria" w:cs="Cambria" w:eastAsia="Cambria" w:hAnsi="Cambria"/>
+          <w:b/>
+          <w:bCs/>
+          <w:color w:val="0A2A43"/>
+          <w:sz w:val="30"/>
+          <w:szCs w:val="30"/>
+        </w:rPr>
+        <w:t xml:space="preserve">Phased Implementation &amp; Roadmap</w:t>
+      </w:r>
+    </w:p>
+    <w:p>
+      <w:pPr>
+        <w:spacing w:after="200" w:line="300"/>
+      </w:pPr>
+      <w:r>
+        <w:rPr>
+          <w:rFonts w:ascii="Calibri" w:cs="Calibri" w:eastAsia="Calibri" w:hAnsi="Calibri"/>
+          <w:i/>
+          <w:iCs/>
+          <w:color w:val="5B6472"/>
+          <w:sz w:val="23"/>
+          <w:szCs w:val="23"/>
+        </w:rPr>
+        <w:t xml:space="preserve">No invented dates. A single-team roadmap cannot credibly commit to a quarter, so this is sequenced by what strengthens governance depth first, not promised timing.</w:t>
+      </w:r>
+    </w:p>
+    <w:p>
+      <w:pPr>
+        <w:pStyle w:val="Heading2"/>
+        <w:spacing w:after="140" w:before="320"/>
+      </w:pPr>
+      <w:r>
+        <w:rPr>
+          <w:rFonts w:ascii="Cambria" w:cs="Cambria" w:eastAsia="Cambria" w:hAnsi="Cambria"/>
+          <w:b/>
+          <w:bCs/>
+          <w:color w:val="0A2A43"/>
+          <w:sz w:val="24"/>
+          <w:szCs w:val="24"/>
+        </w:rPr>
+        <w:t xml:space="preserve">Delivered (MVP, live today)</w:t>
+      </w:r>
+    </w:p>
+    <w:p>
+      <w:pPr>
+        <w:spacing w:after="160" w:line="288"/>
+      </w:pPr>
+      <w:r>
+        <w:rPr>
+          <w:rFonts w:ascii="Calibri" w:cs="Calibri" w:eastAsia="Calibri" w:hAnsi="Calibri"/>
+          <w:color w:val="1F2937"/>
+          <w:sz w:val="21"/>
+          <w:szCs w:val="21"/>
+        </w:rPr>
+        <w:t xml:space="preserve">The full pipeline (Discovery through Observability), real runtime governance (kill-switch, audit trail, tool allowlist, PII redaction), real multi-tenancy and SSO, a real AI Gateway with multi-provider fallback, and the declared-vs-actual reconciliation and preflight-check APIs for agents built outside the platform. Value measured today by the Business Value figures above.</w:t>
+      </w:r>
+    </w:p>
+    <w:p>
+      <w:pPr>
+        <w:pStyle w:val="Heading2"/>
+        <w:spacing w:after="140" w:before="320"/>
+      </w:pPr>
+      <w:r>
+        <w:rPr>
+          <w:rFonts w:ascii="Cambria" w:cs="Cambria" w:eastAsia="Cambria" w:hAnsi="Cambria"/>
+          <w:b/>
+          <w:bCs/>
+          <w:color w:val="0A2A43"/>
+          <w:sz w:val="24"/>
+          <w:szCs w:val="24"/>
+        </w:rPr>
+        <w:t xml:space="preserve">Next — deepens governance itself</w:t>
+      </w:r>
+    </w:p>
+    <w:p>
+      <w:pPr>
+        <w:pStyle w:val="ListParagraph"/>
+        <w:numPr>
+          <w:ilvl w:val="0"/>
+          <w:numId w:val="2"/>
+        </w:numPr>
+        <w:spacing w:after="90" w:line="276"/>
+      </w:pPr>
+      <w:r>
+        <w:rPr>
+          <w:rFonts w:ascii="Calibri" w:cs="Calibri" w:eastAsia="Calibri" w:hAnsi="Calibri"/>
+          <w:color w:val="1F2937"/>
+          <w:sz w:val="21"/>
+          <w:szCs w:val="21"/>
+        </w:rPr>
+        <w:t xml:space="preserve">Governance templates per regulatory regime — different required-control sets for, e.g., GDPR versus a purely internal tool, instead of one fixed set. Value: fewer generic controls forced onto use cases that need a specific regime's rules.</w:t>
+      </w:r>
+    </w:p>
+    <w:p>
+      <w:pPr>
+        <w:pStyle w:val="ListParagraph"/>
+        <w:numPr>
+          <w:ilvl w:val="0"/>
+          <w:numId w:val="2"/>
+        </w:numPr>
+        <w:spacing w:after="90" w:line="276"/>
+      </w:pPr>
+      <w:r>
+        <w:rPr>
+          <w:rFonts w:ascii="Calibri" w:cs="Calibri" w:eastAsia="Calibri" w:hAnsi="Calibri"/>
+          <w:color w:val="1F2937"/>
+          <w:sz w:val="21"/>
+          <w:szCs w:val="21"/>
+        </w:rPr>
+        <w:t xml:space="preserve">Configurable PII patterns per org/region — PII detection is currently a fixed regex set; real orgs in other jurisdictions need their own patterns. Value: real compliance coverage outside the one region this was built for.</w:t>
+      </w:r>
+    </w:p>
+    <w:p>
+      <w:pPr>
+        <w:pStyle w:val="ListParagraph"/>
+        <w:numPr>
+          <w:ilvl w:val="0"/>
+          <w:numId w:val="2"/>
+        </w:numPr>
+        <w:spacing w:after="90" w:line="276"/>
+      </w:pPr>
+      <w:r>
+        <w:rPr>
+          <w:rFonts w:ascii="Calibri" w:cs="Calibri" w:eastAsia="Calibri" w:hAnsi="Calibri"/>
+          <w:color w:val="1F2937"/>
+          <w:sz w:val="21"/>
+          <w:szCs w:val="21"/>
+        </w:rPr>
+        <w:t xml:space="preserve">Regulatory citation mapping — required controls don't yet cite the specific regulation or clause driving them. Value: audit evidence with real traceability, not just "a control exists."</w:t>
+      </w:r>
+    </w:p>
+    <w:p>
+      <w:pPr>
+        <w:pStyle w:val="ListParagraph"/>
+        <w:numPr>
+          <w:ilvl w:val="0"/>
+          <w:numId w:val="2"/>
+        </w:numPr>
+        <w:spacing w:after="90" w:line="276"/>
+      </w:pPr>
+      <w:r>
+        <w:rPr>
+          <w:rFonts w:ascii="Calibri" w:cs="Calibri" w:eastAsia="Calibri" w:hAnsi="Calibri"/>
+          <w:color w:val="1F2937"/>
+          <w:sz w:val="21"/>
+          <w:szCs w:val="21"/>
+        </w:rPr>
+        <w:t xml:space="preserve">Incident workflow tied to the kill-switch — a structured incident record (severity, resolution, post-mortem) attached to why the kill-switch was engaged. Value: kill-switch events become a managed incident process, not just a log line.</w:t>
+      </w:r>
+    </w:p>
+    <w:p>
+      <w:pPr>
+        <w:pStyle w:val="ListParagraph"/>
+        <w:numPr>
+          <w:ilvl w:val="0"/>
+          <w:numId w:val="2"/>
+        </w:numPr>
+        <w:spacing w:after="90" w:line="276"/>
+      </w:pPr>
+      <w:r>
+        <w:rPr>
+          <w:rFonts w:ascii="Calibri" w:cs="Calibri" w:eastAsia="Calibri" w:hAnsi="Calibri"/>
+          <w:color w:val="1F2937"/>
+          <w:sz w:val="21"/>
+          <w:szCs w:val="21"/>
+        </w:rPr>
+        <w:t xml:space="preserve">Aggregate portfolio risk rollup — a single view of the org's total risk exposure across every use case at once. Value: answers "how exposed are we, in total" without checking every use case by hand.</w:t>
+      </w:r>
+    </w:p>
+    <w:p>
+      <w:pPr>
+        <w:pStyle w:val="Heading2"/>
+        <w:spacing w:after="140" w:before="320"/>
+      </w:pPr>
+      <w:r>
+        <w:rPr>
+          <w:rFonts w:ascii="Cambria" w:cs="Cambria" w:eastAsia="Cambria" w:hAnsi="Cambria"/>
+          <w:b/>
+          <w:bCs/>
+          <w:color w:val="0A2A43"/>
+          <w:sz w:val="24"/>
+          <w:szCs w:val="24"/>
+        </w:rPr>
+        <w:t xml:space="preserve">Later — extends the pipeline's reach</w:t>
+      </w:r>
+    </w:p>
+    <w:p>
+      <w:pPr>
+        <w:pStyle w:val="ListParagraph"/>
+        <w:numPr>
+          <w:ilvl w:val="0"/>
+          <w:numId w:val="2"/>
+        </w:numPr>
+        <w:spacing w:after="90" w:line="276"/>
+      </w:pPr>
+      <w:r>
+        <w:rPr>
+          <w:rFonts w:ascii="Calibri" w:cs="Calibri" w:eastAsia="Calibri" w:hAnsi="Calibri"/>
+          <w:color w:val="1F2937"/>
+          <w:sz w:val="21"/>
+          <w:szCs w:val="21"/>
+        </w:rPr>
+        <w:t xml:space="preserve">Intake templates and reference architecture templates for common use-case shapes, to speed up the common case instead of starting blank every time.</w:t>
+      </w:r>
+    </w:p>
+    <w:p>
+      <w:pPr>
+        <w:pStyle w:val="ListParagraph"/>
+        <w:numPr>
+          <w:ilvl w:val="0"/>
+          <w:numId w:val="2"/>
+        </w:numPr>
+        <w:spacing w:after="90" w:line="276"/>
+      </w:pPr>
+      <w:r>
+        <w:rPr>
+          <w:rFonts w:ascii="Calibri" w:cs="Calibri" w:eastAsia="Calibri" w:hAnsi="Calibri"/>
+          <w:color w:val="1F2937"/>
+          <w:sz w:val="21"/>
+          <w:szCs w:val="21"/>
+        </w:rPr>
+        <w:t xml:space="preserve">Vendor/model and data-source blast-radius reverse lookup — "if this model or data source is compromised, which use cases are affected" answerable directly instead of checked by hand.</w:t>
+      </w:r>
+    </w:p>
+    <w:p>
+      <w:pPr>
+        <w:pStyle w:val="ListParagraph"/>
+        <w:numPr>
+          <w:ilvl w:val="0"/>
+          <w:numId w:val="2"/>
+        </w:numPr>
+        <w:spacing w:after="90" w:line="276"/>
+      </w:pPr>
+      <w:r>
+        <w:rPr>
+          <w:rFonts w:ascii="Calibri" w:cs="Calibri" w:eastAsia="Calibri" w:hAnsi="Calibri"/>
+          <w:color w:val="1F2937"/>
+          <w:sz w:val="21"/>
+          <w:szCs w:val="21"/>
+        </w:rPr>
+        <w:t xml:space="preserve">Configurable approval workflows per org, and an in-app notification center alongside the existing real Slack integration.</w:t>
+      </w:r>
+    </w:p>
+    <w:p>
+      <w:pPr>
+        <w:pStyle w:val="Heading2"/>
+        <w:spacing w:after="140" w:before="320"/>
+      </w:pPr>
+      <w:r>
+        <w:rPr>
+          <w:rFonts w:ascii="Cambria" w:cs="Cambria" w:eastAsia="Cambria" w:hAnsi="Cambria"/>
+          <w:b/>
+          <w:bCs/>
+          <w:color w:val="0A2A43"/>
+          <w:sz w:val="24"/>
+          <w:szCs w:val="24"/>
+        </w:rPr>
+        <w:t xml:space="preserve">Platform hardening — not user-facing, but what makes this credible as production infrastructure</w:t>
+      </w:r>
+    </w:p>
+    <w:p>
+      <w:pPr>
+        <w:pStyle w:val="ListParagraph"/>
+        <w:numPr>
+          <w:ilvl w:val="0"/>
+          <w:numId w:val="2"/>
+        </w:numPr>
+        <w:spacing w:after="90" w:line="276"/>
+      </w:pPr>
+      <w:r>
+        <w:rPr>
+          <w:rFonts w:ascii="Calibri" w:cs="Calibri" w:eastAsia="Calibri" w:hAnsi="Calibri"/>
+          <w:color w:val="1F2937"/>
+          <w:sz w:val="21"/>
+          <w:szCs w:val="21"/>
+        </w:rPr>
+        <w:t xml:space="preserve">Broader end-to-end test coverage, a formal accessibility audit, an OpenAPI spec for the public API, SCIM/automated user provisioning, per-tenant branding, a first-run interactive tour, pagination/performance work at genuine enterprise scale, and real Privacy Policy / ToS / DPA documents ahead of any real production deployment.</w:t>
+      </w:r>
+    </w:p>
     <w:p>
       <w:pPr>
         <w:pStyle w:val="Heading1"/>

</xml_diff>